<commit_message>
feat: Enhance Word document rendering with support for nested request and response structures
</commit_message>
<xml_diff>
--- a/assets/api_template.docx
+++ b/assets/api_template.docx
@@ -328,9 +328,6 @@
     <w:p>
       <w:pPr>
         <w:ind w:firstLine="482"/>
-        <w:rPr>
-          <w:rFonts w:hint="eastAsia"/>
-        </w:rPr>
       </w:pPr>
       <w:r>
         <w:rPr>
@@ -549,7 +546,6 @@
       <w:pPr>
         <w:ind w:firstLineChars="0" w:firstLine="0"/>
         <w:rPr>
-          <w:rFonts w:hint="eastAsia"/>
           <w:b/>
         </w:rPr>
       </w:pPr>
@@ -750,7 +746,6 @@
       <w:pPr>
         <w:ind w:firstLine="482"/>
         <w:rPr>
-          <w:rFonts w:hint="eastAsia"/>
           <w:b/>
         </w:rPr>
       </w:pPr>
@@ -969,6 +964,207 @@
         </w:tc>
       </w:tr>
     </w:tbl>
+    <w:p>
+      <w:pPr>
+        <w:ind w:firstLineChars="0" w:firstLine="0"/>
+      </w:pPr>
+    </w:p>
+    <w:tbl>
+      <w:tblPr>
+        <w:tblW w:w="5000" w:type="pct"/>
+        <w:tblBorders>
+          <w:top w:val="single" w:sz="0" w:space="0" w:color="auto"/>
+          <w:left w:val="single" w:sz="0" w:space="0" w:color="auto"/>
+          <w:bottom w:val="single" w:sz="0" w:space="0" w:color="auto"/>
+          <w:right w:val="single" w:sz="0" w:space="0" w:color="auto"/>
+          <w:insideH w:val="single" w:sz="0" w:space="0" w:color="auto"/>
+          <w:insideV w:val="single" w:sz="0" w:space="0" w:color="auto"/>
+        </w:tblBorders>
+        <w:tblLook w:val="04A0" w:firstRow="1" w:lastRow="0" w:firstColumn="1" w:lastColumn="0" w:noHBand="0" w:noVBand="1"/>
+      </w:tblPr>
+      <w:tblGrid>
+        <w:gridCol w:w="2067"/>
+        <w:gridCol w:w="1978"/>
+        <w:gridCol w:w="2488"/>
+        <w:gridCol w:w="1989"/>
+      </w:tblGrid>
+      <w:tr>
+        <w:trPr>
+          <w:trHeight w:val="311"/>
+        </w:trPr>
+        <w:tc>
+          <w:tcPr>
+            <w:tcW w:w="1206" w:type="pct"/>
+            <w:shd w:val="clear" w:color="auto" w:fill="DAE3F4" w:themeFill="accent1" w:themeFillTint="32"/>
+            <w:vAlign w:val="center"/>
+          </w:tcPr>
+          <w:p>
+            <w:pPr>
+              <w:ind w:firstLineChars="0" w:firstLine="0"/>
+              <w:jc w:val="center"/>
+              <w:rPr>
+                <w:b/>
+                <w:bCs/>
+              </w:rPr>
+            </w:pPr>
+            <w:r>
+              <w:rPr>
+                <w:rFonts w:hint="eastAsia"/>
+                <w:b/>
+                <w:bCs/>
+              </w:rPr>
+              <w:t>字段名称</w:t>
+            </w:r>
+          </w:p>
+        </w:tc>
+        <w:tc>
+          <w:tcPr>
+            <w:tcW w:w="1145" w:type="pct"/>
+            <w:shd w:val="clear" w:color="auto" w:fill="DAE3F4" w:themeFill="accent1" w:themeFillTint="32"/>
+            <w:vAlign w:val="center"/>
+          </w:tcPr>
+          <w:p>
+            <w:pPr>
+              <w:ind w:firstLineChars="0" w:firstLine="0"/>
+              <w:jc w:val="center"/>
+              <w:rPr>
+                <w:b/>
+                <w:bCs/>
+              </w:rPr>
+            </w:pPr>
+            <w:r>
+              <w:rPr>
+                <w:rFonts w:hint="eastAsia"/>
+                <w:b/>
+                <w:bCs/>
+              </w:rPr>
+              <w:t>字段</w:t>
+            </w:r>
+            <w:r>
+              <w:rPr>
+                <w:b/>
+                <w:bCs/>
+              </w:rPr>
+              <w:t>类型</w:t>
+            </w:r>
+          </w:p>
+        </w:tc>
+        <w:tc>
+          <w:tcPr>
+            <w:tcW w:w="1497" w:type="pct"/>
+            <w:shd w:val="clear" w:color="auto" w:fill="DAE3F4" w:themeFill="accent1" w:themeFillTint="32"/>
+            <w:vAlign w:val="center"/>
+          </w:tcPr>
+          <w:p>
+            <w:pPr>
+              <w:ind w:firstLineChars="0" w:firstLine="0"/>
+              <w:jc w:val="center"/>
+              <w:rPr>
+                <w:b/>
+                <w:bCs/>
+              </w:rPr>
+            </w:pPr>
+            <w:proofErr w:type="gramStart"/>
+            <w:r>
+              <w:rPr>
+                <w:rFonts w:hint="eastAsia"/>
+                <w:b/>
+                <w:bCs/>
+              </w:rPr>
+              <w:t>必填项</w:t>
+            </w:r>
+            <w:proofErr w:type="gramEnd"/>
+          </w:p>
+        </w:tc>
+        <w:tc>
+          <w:tcPr>
+            <w:tcW w:w="1153" w:type="pct"/>
+            <w:shd w:val="clear" w:color="auto" w:fill="DAE3F4" w:themeFill="accent1" w:themeFillTint="32"/>
+            <w:vAlign w:val="center"/>
+          </w:tcPr>
+          <w:p>
+            <w:pPr>
+              <w:ind w:firstLineChars="0" w:firstLine="0"/>
+              <w:jc w:val="center"/>
+              <w:rPr>
+                <w:b/>
+                <w:bCs/>
+              </w:rPr>
+            </w:pPr>
+            <w:r>
+              <w:rPr>
+                <w:rFonts w:hint="eastAsia"/>
+                <w:b/>
+                <w:bCs/>
+              </w:rPr>
+              <w:t>描述</w:t>
+            </w:r>
+          </w:p>
+        </w:tc>
+      </w:tr>
+      <w:tr>
+        <w:tc>
+          <w:tcPr>
+            <w:tcW w:w="1206" w:type="pct"/>
+          </w:tcPr>
+          <w:p>
+            <w:pPr>
+              <w:ind w:firstLine="480"/>
+            </w:pPr>
+            <w:r>
+              <w:t>__NESTED_NAME__</w:t>
+            </w:r>
+          </w:p>
+        </w:tc>
+        <w:tc>
+          <w:tcPr>
+            <w:tcW w:w="1145" w:type="pct"/>
+          </w:tcPr>
+          <w:p>
+            <w:pPr>
+              <w:ind w:firstLine="480"/>
+            </w:pPr>
+            <w:r>
+              <w:t>__NESTED_TYPE__</w:t>
+            </w:r>
+          </w:p>
+        </w:tc>
+        <w:tc>
+          <w:tcPr>
+            <w:tcW w:w="1497" w:type="pct"/>
+          </w:tcPr>
+          <w:p>
+            <w:pPr>
+              <w:ind w:firstLine="480"/>
+            </w:pPr>
+            <w:r>
+              <w:t>__NESTED_REQUIRED__</w:t>
+            </w:r>
+          </w:p>
+        </w:tc>
+        <w:tc>
+          <w:tcPr>
+            <w:tcW w:w="1153" w:type="pct"/>
+          </w:tcPr>
+          <w:p>
+            <w:pPr>
+              <w:ind w:firstLine="480"/>
+            </w:pPr>
+            <w:r>
+              <w:t>__NESTED_DESC__</w:t>
+            </w:r>
+          </w:p>
+        </w:tc>
+      </w:tr>
+    </w:tbl>
+    <w:p>
+      <w:pPr>
+        <w:ind w:firstLineChars="0" w:firstLine="0"/>
+        <w:rPr>
+          <w:rFonts w:hint="eastAsia"/>
+        </w:rPr>
+      </w:pPr>
+    </w:p>
     <w:p>
       <w:pPr>
         <w:ind w:firstLine="480"/>

</xml_diff>

<commit_message>
feat: Update Word document templates for improved structure and clarity in API and DB sections
</commit_message>
<xml_diff>
--- a/assets/api_template.docx
+++ b/assets/api_template.docx
@@ -750,6 +750,194 @@
         </w:rPr>
       </w:pPr>
     </w:p>
+    <w:tbl>
+      <w:tblPr>
+        <w:tblW w:w="5000" w:type="pct"/>
+        <w:tblBorders>
+          <w:top w:val="single" w:sz="0" w:space="0" w:color="auto"/>
+          <w:left w:val="single" w:sz="0" w:space="0" w:color="auto"/>
+          <w:bottom w:val="single" w:sz="0" w:space="0" w:color="auto"/>
+          <w:right w:val="single" w:sz="0" w:space="0" w:color="auto"/>
+          <w:insideH w:val="single" w:sz="0" w:space="0" w:color="auto"/>
+          <w:insideV w:val="single" w:sz="0" w:space="0" w:color="auto"/>
+        </w:tblBorders>
+        <w:tblLook w:val="04A0" w:firstRow="1" w:lastRow="0" w:firstColumn="1" w:lastColumn="0" w:noHBand="0" w:noVBand="1"/>
+      </w:tblPr>
+      <w:tblGrid>
+        <w:gridCol w:w="2067"/>
+        <w:gridCol w:w="1978"/>
+        <w:gridCol w:w="2488"/>
+        <w:gridCol w:w="1989"/>
+      </w:tblGrid>
+      <w:tr>
+        <w:trPr>
+          <w:trHeight w:val="311"/>
+        </w:trPr>
+        <w:tc>
+          <w:tcPr>
+            <w:tcW w:w="1206" w:type="pct"/>
+            <w:shd w:val="clear" w:color="auto" w:fill="DAE3F4" w:themeFill="accent1" w:themeFillTint="32"/>
+            <w:vAlign w:val="center"/>
+          </w:tcPr>
+          <w:p>
+            <w:pPr>
+              <w:ind w:firstLineChars="0" w:firstLine="0"/>
+              <w:jc w:val="center"/>
+              <w:rPr>
+                <w:b/>
+                <w:bCs/>
+              </w:rPr>
+            </w:pPr>
+            <w:r>
+              <w:rPr>
+                <w:rFonts w:hint="eastAsia"/>
+                <w:b/>
+                <w:bCs/>
+              </w:rPr>
+              <w:t>字段名称</w:t>
+            </w:r>
+          </w:p>
+        </w:tc>
+        <w:tc>
+          <w:tcPr>
+            <w:tcW w:w="1145" w:type="pct"/>
+            <w:shd w:val="clear" w:color="auto" w:fill="DAE3F4" w:themeFill="accent1" w:themeFillTint="32"/>
+            <w:vAlign w:val="center"/>
+          </w:tcPr>
+          <w:p>
+            <w:pPr>
+              <w:ind w:firstLineChars="0" w:firstLine="0"/>
+              <w:jc w:val="center"/>
+              <w:rPr>
+                <w:b/>
+                <w:bCs/>
+              </w:rPr>
+            </w:pPr>
+            <w:r>
+              <w:rPr>
+                <w:rFonts w:hint="eastAsia"/>
+                <w:b/>
+                <w:bCs/>
+              </w:rPr>
+              <w:t>字段</w:t>
+            </w:r>
+            <w:r>
+              <w:rPr>
+                <w:b/>
+                <w:bCs/>
+              </w:rPr>
+              <w:t>类型</w:t>
+            </w:r>
+          </w:p>
+        </w:tc>
+        <w:tc>
+          <w:tcPr>
+            <w:tcW w:w="1497" w:type="pct"/>
+            <w:shd w:val="clear" w:color="auto" w:fill="DAE3F4" w:themeFill="accent1" w:themeFillTint="32"/>
+            <w:vAlign w:val="center"/>
+          </w:tcPr>
+          <w:p>
+            <w:pPr>
+              <w:ind w:firstLineChars="0" w:firstLine="0"/>
+              <w:jc w:val="center"/>
+              <w:rPr>
+                <w:b/>
+                <w:bCs/>
+              </w:rPr>
+            </w:pPr>
+            <w:proofErr w:type="gramStart"/>
+            <w:r>
+              <w:rPr>
+                <w:rFonts w:hint="eastAsia"/>
+                <w:b/>
+                <w:bCs/>
+              </w:rPr>
+              <w:t>必填项</w:t>
+            </w:r>
+            <w:proofErr w:type="gramEnd"/>
+          </w:p>
+        </w:tc>
+        <w:tc>
+          <w:tcPr>
+            <w:tcW w:w="1153" w:type="pct"/>
+            <w:shd w:val="clear" w:color="auto" w:fill="DAE3F4" w:themeFill="accent1" w:themeFillTint="32"/>
+            <w:vAlign w:val="center"/>
+          </w:tcPr>
+          <w:p>
+            <w:pPr>
+              <w:ind w:firstLineChars="0" w:firstLine="0"/>
+              <w:jc w:val="center"/>
+              <w:rPr>
+                <w:b/>
+                <w:bCs/>
+              </w:rPr>
+            </w:pPr>
+            <w:r>
+              <w:rPr>
+                <w:rFonts w:hint="eastAsia"/>
+                <w:b/>
+                <w:bCs/>
+              </w:rPr>
+              <w:t>描述</w:t>
+            </w:r>
+          </w:p>
+        </w:tc>
+      </w:tr>
+      <w:tr>
+        <w:tc>
+          <w:tcPr>
+            <w:tcW w:w="1206" w:type="pct"/>
+          </w:tcPr>
+          <w:p>
+            <w:pPr>
+              <w:ind w:firstLine="480"/>
+            </w:pPr>
+            <w:r>
+              <w:t>__REQ_NESTED_NAME__</w:t>
+            </w:r>
+          </w:p>
+        </w:tc>
+        <w:tc>
+          <w:tcPr>
+            <w:tcW w:w="1145" w:type="pct"/>
+          </w:tcPr>
+          <w:p>
+            <w:pPr>
+              <w:ind w:firstLine="480"/>
+            </w:pPr>
+            <w:r>
+              <w:t>__REQ_NESTED_TYPE__</w:t>
+            </w:r>
+          </w:p>
+        </w:tc>
+        <w:tc>
+          <w:tcPr>
+            <w:tcW w:w="1497" w:type="pct"/>
+          </w:tcPr>
+          <w:p>
+            <w:pPr>
+              <w:ind w:firstLine="480"/>
+            </w:pPr>
+            <w:r>
+              <w:t>__REQ_NESTED_REQUIRED__</w:t>
+            </w:r>
+          </w:p>
+        </w:tc>
+        <w:tc>
+          <w:tcPr>
+            <w:tcW w:w="1153" w:type="pct"/>
+          </w:tcPr>
+          <w:p>
+            <w:pPr>
+              <w:ind w:firstLine="480"/>
+            </w:pPr>
+            <w:r>
+              <w:t>__REQ_NESTED_DESC__</w:t>
+            </w:r>
+          </w:p>
+        </w:tc>
+      </w:tr>
+    </w:tbl>
     <w:p>
       <w:pPr>
         <w:ind w:firstLine="482"/>
@@ -1112,7 +1300,7 @@
               <w:ind w:firstLine="480"/>
             </w:pPr>
             <w:r>
-              <w:t>__NESTED_NAME__</w:t>
+              <w:t>__RESP_NESTED_NAME__</w:t>
             </w:r>
           </w:p>
         </w:tc>
@@ -1125,7 +1313,7 @@
               <w:ind w:firstLine="480"/>
             </w:pPr>
             <w:r>
-              <w:t>__NESTED_TYPE__</w:t>
+              <w:t>__RESP_NESTED_TYPE__</w:t>
             </w:r>
           </w:p>
         </w:tc>
@@ -1138,7 +1326,7 @@
               <w:ind w:firstLine="480"/>
             </w:pPr>
             <w:r>
-              <w:t>__NESTED_REQUIRED__</w:t>
+              <w:t>__RESP_NESTED_REQUIRED__</w:t>
             </w:r>
           </w:p>
         </w:tc>
@@ -1151,7 +1339,7 @@
               <w:ind w:firstLine="480"/>
             </w:pPr>
             <w:r>
-              <w:t>__NESTED_DESC__</w:t>
+              <w:t>__RESP_NESTED_DESC__</w:t>
             </w:r>
           </w:p>
         </w:tc>

</xml_diff>

<commit_message>
feat(ui): allow multi-select and open output folder buttons for docs
- Support multiple OpenAPI and DDL file selection in file dialogs
- Add buttons to open output folders for API and DB docs in UI
- Implement logic to handle multiple input paths and generate docs with unique filenames
- Refactor generate_docs to process multiple OpenAPI and DDL files with distinct output names
- Modify doc services to accept an optional output filename parameter for custom naming
- Enhance schema parser to normalize and merge allOf schemas for robustness
</commit_message>
<xml_diff>
--- a/assets/api_template.docx
+++ b/assets/api_template.docx
@@ -4,80 +4,19 @@
   <w:body>
     <w:p>
       <w:pPr>
-        <w:pStyle w:val="3"/>
-        <w:spacing w:before="156" w:after="156"/>
+        <w:ind w:firstLine="480"/>
       </w:pPr>
       <w:r>
-        <w:rPr>
-          <w:rFonts w:hint="eastAsia"/>
-        </w:rPr>
-        <w:t>XX</w:t>
-      </w:r>
-      <w:r>
-        <w:rPr>
-          <w:rFonts w:hint="eastAsia"/>
-        </w:rPr>
-        <w:t>管理</w:t>
+        <w:t>{% for ep in api.endpoints %}</w:t>
       </w:r>
     </w:p>
     <w:p>
       <w:pPr>
-        <w:ind w:firstLine="480"/>
-      </w:pPr>
-      <w:r>
-        <w:t xml:space="preserve">{% for ep in </w:t>
-      </w:r>
-      <w:proofErr w:type="spellStart"/>
-      <w:proofErr w:type="gramStart"/>
-      <w:r>
-        <w:t>api.endpoints</w:t>
-      </w:r>
-      <w:proofErr w:type="spellEnd"/>
-      <w:proofErr w:type="gramEnd"/>
-      <w:r>
-        <w:t xml:space="preserve"> %}</w:t>
-      </w:r>
-    </w:p>
-    <w:p>
-      <w:pPr>
         <w:pStyle w:val="4"/>
         <w:spacing w:before="156" w:after="156"/>
       </w:pPr>
-      <w:proofErr w:type="gramStart"/>
       <w:r>
-        <w:t xml:space="preserve">{{ </w:t>
-      </w:r>
-      <w:proofErr w:type="spellStart"/>
-      <w:r>
-        <w:t>ep</w:t>
-      </w:r>
-      <w:proofErr w:type="gramEnd"/>
-      <w:r>
-        <w:t>.summary</w:t>
-      </w:r>
-      <w:proofErr w:type="spellEnd"/>
-      <w:r>
-        <w:t xml:space="preserve"> or </w:t>
-      </w:r>
-      <w:proofErr w:type="spellStart"/>
-      <w:proofErr w:type="gramStart"/>
-      <w:r>
-        <w:t>ep.operationId</w:t>
-      </w:r>
-      <w:proofErr w:type="spellEnd"/>
-      <w:proofErr w:type="gramEnd"/>
-      <w:r>
-        <w:t xml:space="preserve"> or </w:t>
-      </w:r>
-      <w:proofErr w:type="spellStart"/>
-      <w:proofErr w:type="gramStart"/>
-      <w:r>
-        <w:t>ep.path</w:t>
-      </w:r>
-      <w:proofErr w:type="spellEnd"/>
-      <w:proofErr w:type="gramEnd"/>
-      <w:r>
-        <w:t xml:space="preserve"> }}</w:t>
+        <w:t>{{ ep.summary or ep.operationId or ep.path }}</w:t>
       </w:r>
     </w:p>
     <w:p>
@@ -113,29 +52,8 @@
       <w:r>
         <w:t>：</w:t>
       </w:r>
-      <w:proofErr w:type="gramStart"/>
       <w:r>
-        <w:t xml:space="preserve">{{ </w:t>
-      </w:r>
-      <w:proofErr w:type="spellStart"/>
-      <w:r>
-        <w:t>ep</w:t>
-      </w:r>
-      <w:proofErr w:type="gramEnd"/>
-      <w:r>
-        <w:t>.</w:t>
-      </w:r>
-      <w:proofErr w:type="gramStart"/>
-      <w:r>
-        <w:t>path</w:t>
-      </w:r>
-      <w:proofErr w:type="spellEnd"/>
-      <w:r>
-        <w:t xml:space="preserve"> }</w:t>
-      </w:r>
-      <w:proofErr w:type="gramEnd"/>
-      <w:r>
-        <w:t>}</w:t>
+        <w:t>{{ ep.path }}</w:t>
       </w:r>
     </w:p>
     <w:p>
@@ -149,29 +67,8 @@
       <w:r>
         <w:t>请求方式：</w:t>
       </w:r>
-      <w:proofErr w:type="gramStart"/>
       <w:r>
-        <w:t xml:space="preserve">{{ </w:t>
-      </w:r>
-      <w:proofErr w:type="spellStart"/>
-      <w:r>
-        <w:t>ep</w:t>
-      </w:r>
-      <w:proofErr w:type="gramEnd"/>
-      <w:r>
-        <w:t>.method</w:t>
-      </w:r>
-      <w:proofErr w:type="spellEnd"/>
-      <w:r>
-        <w:t xml:space="preserve"> | </w:t>
-      </w:r>
-      <w:proofErr w:type="gramStart"/>
-      <w:r>
-        <w:t>lower }</w:t>
-      </w:r>
-      <w:proofErr w:type="gramEnd"/>
-      <w:r>
-        <w:t>}</w:t>
+        <w:t>{{ ep.method | lower }}</w:t>
       </w:r>
     </w:p>
     <w:p>
@@ -185,34 +82,8 @@
       <w:r>
         <w:t>请求类型：</w:t>
       </w:r>
-      <w:proofErr w:type="gramStart"/>
       <w:r>
-        <w:t xml:space="preserve">{{ </w:t>
-      </w:r>
-      <w:proofErr w:type="spellStart"/>
-      <w:r>
-        <w:t>ep</w:t>
-      </w:r>
-      <w:proofErr w:type="gramEnd"/>
-      <w:r>
-        <w:t>.request_content_type</w:t>
-      </w:r>
-      <w:proofErr w:type="spellEnd"/>
-      <w:r>
-        <w:t xml:space="preserve"> or 'application/</w:t>
-      </w:r>
-      <w:proofErr w:type="spellStart"/>
-      <w:r>
-        <w:t>json</w:t>
-      </w:r>
-      <w:proofErr w:type="spellEnd"/>
-      <w:proofErr w:type="gramStart"/>
-      <w:r>
-        <w:t>' }</w:t>
-      </w:r>
-      <w:proofErr w:type="gramEnd"/>
-      <w:r>
-        <w:t>}</w:t>
+        <w:t>{{ ep.request_content_type or 'application/json' }}</w:t>
       </w:r>
     </w:p>
     <w:p>
@@ -226,29 +97,8 @@
       <w:r>
         <w:t>服务端：</w:t>
       </w:r>
-      <w:proofErr w:type="gramStart"/>
       <w:r>
-        <w:t xml:space="preserve">{{ </w:t>
-      </w:r>
-      <w:proofErr w:type="spellStart"/>
-      <w:r>
-        <w:t>ep</w:t>
-      </w:r>
-      <w:proofErr w:type="gramEnd"/>
-      <w:r>
-        <w:t>.server</w:t>
-      </w:r>
-      <w:proofErr w:type="spellEnd"/>
-      <w:r>
-        <w:t xml:space="preserve"> or '</w:t>
-      </w:r>
-      <w:proofErr w:type="gramStart"/>
-      <w:r>
-        <w:t>' }</w:t>
-      </w:r>
-      <w:proofErr w:type="gramEnd"/>
-      <w:r>
-        <w:t>}</w:t>
+        <w:t>{{ ep.server or '' }}</w:t>
       </w:r>
     </w:p>
     <w:p>
@@ -262,29 +112,8 @@
       <w:r>
         <w:t>客户端：</w:t>
       </w:r>
-      <w:proofErr w:type="gramStart"/>
       <w:r>
-        <w:t xml:space="preserve">{{ </w:t>
-      </w:r>
-      <w:proofErr w:type="spellStart"/>
-      <w:r>
-        <w:t>ep</w:t>
-      </w:r>
-      <w:proofErr w:type="gramEnd"/>
-      <w:r>
-        <w:t>.client</w:t>
-      </w:r>
-      <w:proofErr w:type="spellEnd"/>
-      <w:r>
-        <w:t xml:space="preserve"> or '</w:t>
-      </w:r>
-      <w:proofErr w:type="gramStart"/>
-      <w:r>
-        <w:t>' }</w:t>
-      </w:r>
-      <w:proofErr w:type="gramEnd"/>
-      <w:r>
-        <w:t>}</w:t>
+        <w:t>{{ ep.client or '' }}</w:t>
       </w:r>
     </w:p>
     <w:p>
@@ -298,31 +127,8 @@
       <w:r>
         <w:t>描述：</w:t>
       </w:r>
-      <w:proofErr w:type="gramStart"/>
       <w:r>
-        <w:t xml:space="preserve">{{ </w:t>
-      </w:r>
-      <w:proofErr w:type="spellStart"/>
-      <w:r>
-        <w:t>ep</w:t>
-      </w:r>
-      <w:proofErr w:type="gramEnd"/>
-      <w:r>
-        <w:t>.description</w:t>
-      </w:r>
-      <w:proofErr w:type="spellEnd"/>
-      <w:r>
-        <w:t xml:space="preserve"> or </w:t>
-      </w:r>
-      <w:proofErr w:type="spellStart"/>
-      <w:proofErr w:type="gramStart"/>
-      <w:r>
-        <w:t>ep.summary</w:t>
-      </w:r>
-      <w:proofErr w:type="spellEnd"/>
-      <w:proofErr w:type="gramEnd"/>
-      <w:r>
-        <w:t xml:space="preserve"> }}</w:t>
+        <w:t>{{ ep.description or ep.summary }}</w:t>
       </w:r>
     </w:p>
     <w:p>
@@ -445,7 +251,6 @@
                 <w:bCs/>
               </w:rPr>
             </w:pPr>
-            <w:proofErr w:type="gramStart"/>
             <w:r>
               <w:rPr>
                 <w:rFonts w:hint="eastAsia"/>
@@ -454,7 +259,6 @@
               </w:rPr>
               <w:t>必填项</w:t>
             </w:r>
-            <w:proofErr w:type="gramEnd"/>
           </w:p>
         </w:tc>
         <w:tc>
@@ -645,7 +449,6 @@
                 <w:bCs/>
               </w:rPr>
             </w:pPr>
-            <w:proofErr w:type="gramStart"/>
             <w:r>
               <w:rPr>
                 <w:rFonts w:hint="eastAsia"/>
@@ -654,7 +457,6 @@
               </w:rPr>
               <w:t>必填项</w:t>
             </w:r>
-            <w:proofErr w:type="gramEnd"/>
           </w:p>
         </w:tc>
         <w:tc>
@@ -764,10 +566,10 @@
         <w:tblLook w:val="04A0" w:firstRow="1" w:lastRow="0" w:firstColumn="1" w:lastColumn="0" w:noHBand="0" w:noVBand="1"/>
       </w:tblPr>
       <w:tblGrid>
-        <w:gridCol w:w="2067"/>
-        <w:gridCol w:w="1978"/>
-        <w:gridCol w:w="2488"/>
-        <w:gridCol w:w="1989"/>
+        <w:gridCol w:w="2080"/>
+        <w:gridCol w:w="2009"/>
+        <w:gridCol w:w="2414"/>
+        <w:gridCol w:w="2019"/>
       </w:tblGrid>
       <w:tr>
         <w:trPr>
@@ -845,7 +647,6 @@
                 <w:bCs/>
               </w:rPr>
             </w:pPr>
-            <w:proofErr w:type="gramStart"/>
             <w:r>
               <w:rPr>
                 <w:rFonts w:hint="eastAsia"/>
@@ -854,7 +655,6 @@
               </w:rPr>
               <w:t>必填项</w:t>
             </w:r>
-            <w:proofErr w:type="gramEnd"/>
           </w:p>
         </w:tc>
         <w:tc>
@@ -1055,7 +855,6 @@
                 <w:bCs/>
               </w:rPr>
             </w:pPr>
-            <w:proofErr w:type="gramStart"/>
             <w:r>
               <w:rPr>
                 <w:rFonts w:hint="eastAsia"/>
@@ -1064,7 +863,6 @@
               </w:rPr>
               <w:t>必填项</w:t>
             </w:r>
-            <w:proofErr w:type="gramEnd"/>
           </w:p>
         </w:tc>
         <w:tc>
@@ -1171,10 +969,10 @@
         <w:tblLook w:val="04A0" w:firstRow="1" w:lastRow="0" w:firstColumn="1" w:lastColumn="0" w:noHBand="0" w:noVBand="1"/>
       </w:tblPr>
       <w:tblGrid>
-        <w:gridCol w:w="2067"/>
-        <w:gridCol w:w="1978"/>
-        <w:gridCol w:w="2488"/>
-        <w:gridCol w:w="1989"/>
+        <w:gridCol w:w="2082"/>
+        <w:gridCol w:w="2013"/>
+        <w:gridCol w:w="2405"/>
+        <w:gridCol w:w="2022"/>
       </w:tblGrid>
       <w:tr>
         <w:trPr>
@@ -1252,7 +1050,6 @@
                 <w:bCs/>
               </w:rPr>
             </w:pPr>
-            <w:proofErr w:type="gramStart"/>
             <w:r>
               <w:rPr>
                 <w:rFonts w:hint="eastAsia"/>
@@ -1261,7 +1058,6 @@
               </w:rPr>
               <w:t>必填项</w:t>
             </w:r>
-            <w:proofErr w:type="gramEnd"/>
           </w:p>
         </w:tc>
         <w:tc>
@@ -1348,9 +1144,6 @@
     <w:p>
       <w:pPr>
         <w:ind w:firstLineChars="0" w:firstLine="0"/>
-        <w:rPr>
-          <w:rFonts w:hint="eastAsia"/>
-        </w:rPr>
       </w:pPr>
     </w:p>
     <w:p>
@@ -1358,15 +1151,7 @@
         <w:ind w:firstLine="480"/>
       </w:pPr>
       <w:r>
-        <w:t xml:space="preserve">{% </w:t>
-      </w:r>
-      <w:proofErr w:type="spellStart"/>
-      <w:r>
-        <w:t>endfor</w:t>
-      </w:r>
-      <w:proofErr w:type="spellEnd"/>
-      <w:r>
-        <w:t xml:space="preserve"> %}</w:t>
+        <w:t>{% endfor %}</w:t>
       </w:r>
     </w:p>
     <w:sectPr>

</xml_diff>